<commit_message>
feat: implement mobile pinch-to-zoom for local grid map
</commit_message>
<xml_diff>
--- a/圖騰.docx
+++ b/圖騰.docx
@@ -6,6 +6,14 @@
       <w:tblPr>
         <w:tblW w:w="10915" w:type="dxa"/>
         <w:tblInd w:w="-1281" w:type="dxa"/>
+        <w:tblBorders>
+          <w:top w:val="single" w:sz="4" w:space="0" w:color="auto"/>
+          <w:left w:val="single" w:sz="4" w:space="0" w:color="auto"/>
+          <w:bottom w:val="single" w:sz="4" w:space="0" w:color="auto"/>
+          <w:right w:val="single" w:sz="4" w:space="0" w:color="auto"/>
+          <w:insideH w:val="single" w:sz="4" w:space="0" w:color="auto"/>
+          <w:insideV w:val="single" w:sz="4" w:space="0" w:color="auto"/>
+        </w:tblBorders>
         <w:tblCellMar>
           <w:left w:w="28" w:type="dxa"/>
           <w:right w:w="28" w:type="dxa"/>
@@ -29,12 +37,6 @@
         <w:tc>
           <w:tcPr>
             <w:tcW w:w="1103" w:type="dxa"/>
-            <w:tcBorders>
-              <w:top w:val="single" w:sz="4" w:space="0" w:color="000000"/>
-              <w:left w:val="single" w:sz="4" w:space="0" w:color="000000"/>
-              <w:bottom w:val="single" w:sz="4" w:space="0" w:color="000000"/>
-              <w:right w:val="single" w:sz="4" w:space="0" w:color="000000"/>
-            </w:tcBorders>
             <w:shd w:val="clear" w:color="FFFFFF" w:fill="FFFFFF"/>
             <w:noWrap/>
             <w:vAlign w:val="center"/>
@@ -46,6 +48,16 @@
               <w:spacing w:after="0" w:line="240" w:lineRule="auto"/>
               <w:jc w:val="center"/>
               <w:rPr>
+                <w:rFonts w:ascii="微軟正黑體" w:eastAsia="微軟正黑體" w:hAnsi="微軟正黑體" w:cs="Calibri"/>
+                <w:b/>
+                <w:bCs/>
+                <w:color w:val="000000"/>
+                <w:kern w:val="0"/>
+                <w14:ligatures w14:val="none"/>
+              </w:rPr>
+            </w:pPr>
+            <w:r>
+              <w:rPr>
                 <w:rFonts w:ascii="微軟正黑體" w:eastAsia="微軟正黑體" w:hAnsi="微軟正黑體" w:cs="Calibri" w:hint="eastAsia"/>
                 <w:b/>
                 <w:bCs/>
@@ -53,6 +65,28 @@
                 <w:kern w:val="0"/>
                 <w14:ligatures w14:val="none"/>
               </w:rPr>
+              <w:t>身分別</w:t>
+            </w:r>
+          </w:p>
+        </w:tc>
+        <w:tc>
+          <w:tcPr>
+            <w:tcW w:w="1220" w:type="dxa"/>
+            <w:shd w:val="clear" w:color="FFFFFF" w:fill="FFFFFF"/>
+          </w:tcPr>
+          <w:p>
+            <w:pPr>
+              <w:widowControl/>
+              <w:spacing w:after="0" w:line="240" w:lineRule="auto"/>
+              <w:jc w:val="center"/>
+              <w:rPr>
+                <w:rFonts w:ascii="微軟正黑體" w:eastAsia="微軟正黑體" w:hAnsi="微軟正黑體" w:cs="Calibri"/>
+                <w:b/>
+                <w:bCs/>
+                <w:color w:val="000000"/>
+                <w:kern w:val="0"/>
+                <w14:ligatures w14:val="none"/>
+              </w:rPr>
             </w:pPr>
             <w:r>
               <w:rPr>
@@ -63,44 +97,6 @@
                 <w:kern w:val="0"/>
                 <w14:ligatures w14:val="none"/>
               </w:rPr>
-              <w:t>身分別</w:t>
-            </w:r>
-          </w:p>
-        </w:tc>
-        <w:tc>
-          <w:tcPr>
-            <w:tcW w:w="1220" w:type="dxa"/>
-            <w:tcBorders>
-              <w:top w:val="single" w:sz="4" w:space="0" w:color="000000"/>
-              <w:left w:val="nil"/>
-              <w:bottom w:val="single" w:sz="4" w:space="0" w:color="000000"/>
-              <w:right w:val="nil"/>
-            </w:tcBorders>
-            <w:shd w:val="clear" w:color="FFFFFF" w:fill="FFFFFF"/>
-          </w:tcPr>
-          <w:p>
-            <w:pPr>
-              <w:widowControl/>
-              <w:spacing w:after="0" w:line="240" w:lineRule="auto"/>
-              <w:jc w:val="center"/>
-              <w:rPr>
-                <w:rFonts w:ascii="微軟正黑體" w:eastAsia="微軟正黑體" w:hAnsi="微軟正黑體" w:cs="Calibri" w:hint="eastAsia"/>
-                <w:b/>
-                <w:bCs/>
-                <w:color w:val="000000"/>
-                <w:kern w:val="0"/>
-                <w14:ligatures w14:val="none"/>
-              </w:rPr>
-            </w:pPr>
-            <w:r>
-              <w:rPr>
-                <w:rFonts w:ascii="微軟正黑體" w:eastAsia="微軟正黑體" w:hAnsi="微軟正黑體" w:cs="Calibri" w:hint="eastAsia"/>
-                <w:b/>
-                <w:bCs/>
-                <w:color w:val="000000"/>
-                <w:kern w:val="0"/>
-                <w14:ligatures w14:val="none"/>
-              </w:rPr>
               <w:t>身分證</w:t>
             </w:r>
           </w:p>
@@ -108,12 +104,6 @@
         <w:tc>
           <w:tcPr>
             <w:tcW w:w="0" w:type="auto"/>
-            <w:tcBorders>
-              <w:top w:val="single" w:sz="4" w:space="0" w:color="000000"/>
-              <w:left w:val="nil"/>
-              <w:bottom w:val="single" w:sz="4" w:space="0" w:color="000000"/>
-              <w:right w:val="single" w:sz="4" w:space="0" w:color="000000"/>
-            </w:tcBorders>
             <w:shd w:val="clear" w:color="FFFFFF" w:fill="FFFFFF"/>
             <w:noWrap/>
             <w:vAlign w:val="center"/>
@@ -149,12 +139,6 @@
         <w:tc>
           <w:tcPr>
             <w:tcW w:w="0" w:type="auto"/>
-            <w:tcBorders>
-              <w:top w:val="single" w:sz="4" w:space="0" w:color="000000"/>
-              <w:left w:val="nil"/>
-              <w:bottom w:val="single" w:sz="4" w:space="0" w:color="000000"/>
-              <w:right w:val="single" w:sz="4" w:space="0" w:color="000000"/>
-            </w:tcBorders>
             <w:shd w:val="clear" w:color="FFFFFF" w:fill="FFFFFF"/>
             <w:noWrap/>
             <w:vAlign w:val="center"/>
@@ -190,12 +174,6 @@
         <w:tc>
           <w:tcPr>
             <w:tcW w:w="0" w:type="auto"/>
-            <w:tcBorders>
-              <w:top w:val="single" w:sz="4" w:space="0" w:color="000000"/>
-              <w:left w:val="nil"/>
-              <w:bottom w:val="single" w:sz="4" w:space="0" w:color="000000"/>
-              <w:right w:val="single" w:sz="4" w:space="0" w:color="000000"/>
-            </w:tcBorders>
             <w:shd w:val="clear" w:color="FFFFFF" w:fill="FFFFFF"/>
             <w:noWrap/>
             <w:vAlign w:val="center"/>
@@ -231,12 +209,6 @@
         <w:tc>
           <w:tcPr>
             <w:tcW w:w="0" w:type="auto"/>
-            <w:tcBorders>
-              <w:top w:val="single" w:sz="4" w:space="0" w:color="000000"/>
-              <w:left w:val="nil"/>
-              <w:bottom w:val="single" w:sz="4" w:space="0" w:color="000000"/>
-              <w:right w:val="single" w:sz="4" w:space="0" w:color="000000"/>
-            </w:tcBorders>
             <w:shd w:val="clear" w:color="FFFFFF" w:fill="FFFFFF"/>
             <w:noWrap/>
             <w:vAlign w:val="center"/>
@@ -272,12 +244,6 @@
         <w:tc>
           <w:tcPr>
             <w:tcW w:w="0" w:type="auto"/>
-            <w:tcBorders>
-              <w:top w:val="single" w:sz="4" w:space="0" w:color="000000"/>
-              <w:left w:val="nil"/>
-              <w:bottom w:val="single" w:sz="4" w:space="0" w:color="000000"/>
-              <w:right w:val="single" w:sz="4" w:space="0" w:color="000000"/>
-            </w:tcBorders>
             <w:shd w:val="clear" w:color="FFFFFF" w:fill="FFFFFF"/>
             <w:noWrap/>
             <w:vAlign w:val="center"/>
@@ -313,12 +279,6 @@
         <w:tc>
           <w:tcPr>
             <w:tcW w:w="1372" w:type="dxa"/>
-            <w:tcBorders>
-              <w:top w:val="single" w:sz="4" w:space="0" w:color="000000"/>
-              <w:left w:val="nil"/>
-              <w:bottom w:val="single" w:sz="4" w:space="0" w:color="000000"/>
-              <w:right w:val="single" w:sz="4" w:space="0" w:color="000000"/>
-            </w:tcBorders>
             <w:shd w:val="clear" w:color="FFFFFF" w:fill="FFFFFF"/>
             <w:noWrap/>
             <w:vAlign w:val="center"/>
@@ -359,12 +319,6 @@
         <w:tc>
           <w:tcPr>
             <w:tcW w:w="1103" w:type="dxa"/>
-            <w:tcBorders>
-              <w:top w:val="nil"/>
-              <w:left w:val="single" w:sz="4" w:space="0" w:color="000000"/>
-              <w:bottom w:val="single" w:sz="4" w:space="0" w:color="000000"/>
-              <w:right w:val="single" w:sz="4" w:space="0" w:color="000000"/>
-            </w:tcBorders>
             <w:shd w:val="clear" w:color="FFFFFF" w:fill="FFFFFF"/>
             <w:noWrap/>
             <w:vAlign w:val="center"/>
@@ -398,32 +352,27 @@
         <w:tc>
           <w:tcPr>
             <w:tcW w:w="1220" w:type="dxa"/>
-            <w:tcBorders>
-              <w:top w:val="nil"/>
-              <w:left w:val="nil"/>
-              <w:bottom w:val="single" w:sz="4" w:space="0" w:color="000000"/>
-              <w:right w:val="nil"/>
-            </w:tcBorders>
-            <w:shd w:val="clear" w:color="FFFFFF" w:fill="FFFFFF"/>
-          </w:tcPr>
-          <w:p>
-            <w:pPr>
-              <w:widowControl/>
-              <w:spacing w:after="0" w:line="240" w:lineRule="auto"/>
-              <w:rPr>
-                <w:rFonts w:ascii="Arial" w:eastAsia="新細明體" w:hAnsi="Arial" w:cs="Arial"/>
-                <w:b/>
-                <w:bCs/>
-                <w:color w:val="000000"/>
-                <w:kern w:val="0"/>
-                <w14:ligatures w14:val="none"/>
-              </w:rPr>
-            </w:pPr>
-            <w:r>
-              <w:rPr>
-                <w:rFonts w:ascii="Arial" w:eastAsia="新細明體" w:hAnsi="Arial" w:cs="Arial"/>
-                <w:b/>
-                <w:bCs/>
+            <w:shd w:val="clear" w:color="FFFFFF" w:fill="FFFFFF"/>
+          </w:tcPr>
+          <w:p>
+            <w:pPr>
+              <w:widowControl/>
+              <w:spacing w:after="0" w:line="240" w:lineRule="auto"/>
+              <w:rPr>
+                <w:rFonts w:ascii="Arial" w:eastAsia="新細明體" w:hAnsi="Arial" w:cs="Arial"/>
+                <w:b/>
+                <w:bCs/>
+                <w:color w:val="000000"/>
+                <w:kern w:val="0"/>
+                <w14:ligatures w14:val="none"/>
+              </w:rPr>
+            </w:pPr>
+            <w:r>
+              <w:rPr>
+                <w:rFonts w:ascii="Arial" w:eastAsia="新細明體" w:hAnsi="Arial" w:cs="Arial"/>
+                <w:b/>
+                <w:bCs/>
+                <w:noProof/>
                 <w:color w:val="000000"/>
                 <w:kern w:val="0"/>
                 <w14:ligatures w14:val="none"/>
@@ -469,12 +418,6 @@
         <w:tc>
           <w:tcPr>
             <w:tcW w:w="0" w:type="auto"/>
-            <w:tcBorders>
-              <w:top w:val="nil"/>
-              <w:left w:val="nil"/>
-              <w:bottom w:val="single" w:sz="4" w:space="0" w:color="000000"/>
-              <w:right w:val="single" w:sz="4" w:space="0" w:color="000000"/>
-            </w:tcBorders>
             <w:shd w:val="clear" w:color="FFFFFF" w:fill="FFFFFF"/>
             <w:noWrap/>
             <w:vAlign w:val="center"/>
@@ -484,19 +427,20 @@
               <w:widowControl/>
               <w:spacing w:after="0" w:line="240" w:lineRule="auto"/>
               <w:rPr>
-                <w:rFonts w:ascii="Arial" w:eastAsia="新細明體" w:hAnsi="Arial" w:cs="Arial" w:hint="eastAsia"/>
-                <w:b/>
-                <w:bCs/>
-                <w:color w:val="000000"/>
-                <w:kern w:val="0"/>
-                <w14:ligatures w14:val="none"/>
-              </w:rPr>
-            </w:pPr>
-            <w:r>
-              <w:rPr>
-                <w:rFonts w:ascii="Arial" w:eastAsia="新細明體" w:hAnsi="Arial" w:cs="Arial"/>
-                <w:b/>
-                <w:bCs/>
+                <w:rFonts w:ascii="Arial" w:eastAsia="新細明體" w:hAnsi="Arial" w:cs="Arial"/>
+                <w:b/>
+                <w:bCs/>
+                <w:color w:val="000000"/>
+                <w:kern w:val="0"/>
+                <w14:ligatures w14:val="none"/>
+              </w:rPr>
+            </w:pPr>
+            <w:r>
+              <w:rPr>
+                <w:rFonts w:ascii="Arial" w:eastAsia="新細明體" w:hAnsi="Arial" w:cs="Arial"/>
+                <w:b/>
+                <w:bCs/>
+                <w:noProof/>
                 <w:color w:val="000000"/>
                 <w:kern w:val="0"/>
                 <w14:ligatures w14:val="none"/>
@@ -542,12 +486,6 @@
         <w:tc>
           <w:tcPr>
             <w:tcW w:w="0" w:type="auto"/>
-            <w:tcBorders>
-              <w:top w:val="nil"/>
-              <w:left w:val="nil"/>
-              <w:bottom w:val="single" w:sz="4" w:space="0" w:color="000000"/>
-              <w:right w:val="single" w:sz="4" w:space="0" w:color="000000"/>
-            </w:tcBorders>
             <w:shd w:val="clear" w:color="FFFFFF" w:fill="FFFFFF"/>
             <w:noWrap/>
             <w:vAlign w:val="center"/>
@@ -570,6 +508,7 @@
                 <w:rFonts w:ascii="Arial" w:eastAsia="新細明體" w:hAnsi="Arial" w:cs="Arial"/>
                 <w:b/>
                 <w:bCs/>
+                <w:noProof/>
                 <w:color w:val="000000"/>
                 <w:kern w:val="0"/>
                 <w14:ligatures w14:val="none"/>
@@ -615,12 +554,6 @@
         <w:tc>
           <w:tcPr>
             <w:tcW w:w="0" w:type="auto"/>
-            <w:tcBorders>
-              <w:top w:val="nil"/>
-              <w:left w:val="nil"/>
-              <w:bottom w:val="single" w:sz="4" w:space="0" w:color="000000"/>
-              <w:right w:val="single" w:sz="4" w:space="0" w:color="000000"/>
-            </w:tcBorders>
             <w:shd w:val="clear" w:color="FFFFFF" w:fill="FFFFFF"/>
             <w:noWrap/>
             <w:vAlign w:val="center"/>
@@ -643,6 +576,7 @@
                 <w:rFonts w:ascii="Arial" w:eastAsia="新細明體" w:hAnsi="Arial" w:cs="Arial"/>
                 <w:b/>
                 <w:bCs/>
+                <w:noProof/>
                 <w:color w:val="000000"/>
                 <w:kern w:val="0"/>
                 <w14:ligatures w14:val="none"/>
@@ -688,12 +622,6 @@
         <w:tc>
           <w:tcPr>
             <w:tcW w:w="0" w:type="auto"/>
-            <w:tcBorders>
-              <w:top w:val="nil"/>
-              <w:left w:val="nil"/>
-              <w:bottom w:val="single" w:sz="4" w:space="0" w:color="000000"/>
-              <w:right w:val="single" w:sz="4" w:space="0" w:color="000000"/>
-            </w:tcBorders>
             <w:shd w:val="clear" w:color="FFFFFF" w:fill="FFFFFF"/>
             <w:noWrap/>
             <w:vAlign w:val="center"/>
@@ -716,6 +644,7 @@
                 <w:rFonts w:ascii="Arial" w:eastAsia="新細明體" w:hAnsi="Arial" w:cs="Arial"/>
                 <w:b/>
                 <w:bCs/>
+                <w:noProof/>
                 <w:color w:val="000000"/>
                 <w:kern w:val="0"/>
                 <w14:ligatures w14:val="none"/>
@@ -761,12 +690,6 @@
         <w:tc>
           <w:tcPr>
             <w:tcW w:w="0" w:type="auto"/>
-            <w:tcBorders>
-              <w:top w:val="nil"/>
-              <w:left w:val="nil"/>
-              <w:bottom w:val="single" w:sz="4" w:space="0" w:color="000000"/>
-              <w:right w:val="single" w:sz="4" w:space="0" w:color="000000"/>
-            </w:tcBorders>
             <w:shd w:val="clear" w:color="FFFFFF" w:fill="FFFFFF"/>
             <w:noWrap/>
             <w:vAlign w:val="center"/>
@@ -789,6 +712,7 @@
                 <w:rFonts w:ascii="Arial" w:eastAsia="新細明體" w:hAnsi="Arial" w:cs="Arial"/>
                 <w:b/>
                 <w:bCs/>
+                <w:noProof/>
                 <w:color w:val="000000"/>
                 <w:kern w:val="0"/>
                 <w14:ligatures w14:val="none"/>
@@ -834,12 +758,6 @@
         <w:tc>
           <w:tcPr>
             <w:tcW w:w="1372" w:type="dxa"/>
-            <w:tcBorders>
-              <w:top w:val="nil"/>
-              <w:left w:val="nil"/>
-              <w:bottom w:val="single" w:sz="4" w:space="0" w:color="000000"/>
-              <w:right w:val="single" w:sz="4" w:space="0" w:color="000000"/>
-            </w:tcBorders>
             <w:shd w:val="clear" w:color="FFFFFF" w:fill="FFFFFF"/>
             <w:noWrap/>
             <w:vAlign w:val="center"/>
@@ -862,6 +780,7 @@
                 <w:rFonts w:ascii="Arial" w:eastAsia="新細明體" w:hAnsi="Arial" w:cs="Arial"/>
                 <w:b/>
                 <w:bCs/>
+                <w:noProof/>
                 <w:color w:val="000000"/>
                 <w:kern w:val="0"/>
                 <w14:ligatures w14:val="none"/>
@@ -912,12 +831,6 @@
         <w:tc>
           <w:tcPr>
             <w:tcW w:w="1103" w:type="dxa"/>
-            <w:tcBorders>
-              <w:top w:val="nil"/>
-              <w:left w:val="single" w:sz="4" w:space="0" w:color="000000"/>
-              <w:bottom w:val="single" w:sz="4" w:space="0" w:color="000000"/>
-              <w:right w:val="single" w:sz="4" w:space="0" w:color="000000"/>
-            </w:tcBorders>
             <w:shd w:val="clear" w:color="FFFFFF" w:fill="FFFFFF"/>
             <w:noWrap/>
             <w:vAlign w:val="center"/>
@@ -951,32 +864,27 @@
         <w:tc>
           <w:tcPr>
             <w:tcW w:w="1220" w:type="dxa"/>
-            <w:tcBorders>
-              <w:top w:val="nil"/>
-              <w:left w:val="nil"/>
-              <w:bottom w:val="single" w:sz="4" w:space="0" w:color="000000"/>
-              <w:right w:val="nil"/>
-            </w:tcBorders>
-            <w:shd w:val="clear" w:color="FFFFFF" w:fill="FFFFFF"/>
-          </w:tcPr>
-          <w:p>
-            <w:pPr>
-              <w:widowControl/>
-              <w:spacing w:after="0" w:line="240" w:lineRule="auto"/>
-              <w:rPr>
-                <w:rFonts w:ascii="Arial" w:eastAsia="新細明體" w:hAnsi="Arial" w:cs="Arial"/>
-                <w:b/>
-                <w:bCs/>
-                <w:color w:val="000000"/>
-                <w:kern w:val="0"/>
-                <w14:ligatures w14:val="none"/>
-              </w:rPr>
-            </w:pPr>
-            <w:r>
-              <w:rPr>
-                <w:rFonts w:ascii="Arial" w:eastAsia="新細明體" w:hAnsi="Arial" w:cs="Arial"/>
-                <w:b/>
-                <w:bCs/>
+            <w:shd w:val="clear" w:color="FFFFFF" w:fill="FFFFFF"/>
+          </w:tcPr>
+          <w:p>
+            <w:pPr>
+              <w:widowControl/>
+              <w:spacing w:after="0" w:line="240" w:lineRule="auto"/>
+              <w:rPr>
+                <w:rFonts w:ascii="Arial" w:eastAsia="新細明體" w:hAnsi="Arial" w:cs="Arial"/>
+                <w:b/>
+                <w:bCs/>
+                <w:color w:val="000000"/>
+                <w:kern w:val="0"/>
+                <w14:ligatures w14:val="none"/>
+              </w:rPr>
+            </w:pPr>
+            <w:r>
+              <w:rPr>
+                <w:rFonts w:ascii="Arial" w:eastAsia="新細明體" w:hAnsi="Arial" w:cs="Arial"/>
+                <w:b/>
+                <w:bCs/>
+                <w:noProof/>
                 <w:color w:val="000000"/>
                 <w:kern w:val="0"/>
                 <w14:ligatures w14:val="none"/>
@@ -1022,12 +930,6 @@
         <w:tc>
           <w:tcPr>
             <w:tcW w:w="0" w:type="auto"/>
-            <w:tcBorders>
-              <w:top w:val="nil"/>
-              <w:left w:val="nil"/>
-              <w:bottom w:val="single" w:sz="4" w:space="0" w:color="000000"/>
-              <w:right w:val="single" w:sz="4" w:space="0" w:color="000000"/>
-            </w:tcBorders>
             <w:shd w:val="clear" w:color="FFFFFF" w:fill="FFFFFF"/>
             <w:noWrap/>
             <w:vAlign w:val="center"/>
@@ -1050,6 +952,7 @@
                 <w:rFonts w:ascii="Arial" w:eastAsia="新細明體" w:hAnsi="Arial" w:cs="Arial"/>
                 <w:b/>
                 <w:bCs/>
+                <w:noProof/>
                 <w:color w:val="000000"/>
                 <w:kern w:val="0"/>
                 <w14:ligatures w14:val="none"/>
@@ -1095,12 +998,6 @@
         <w:tc>
           <w:tcPr>
             <w:tcW w:w="0" w:type="auto"/>
-            <w:tcBorders>
-              <w:top w:val="nil"/>
-              <w:left w:val="nil"/>
-              <w:bottom w:val="single" w:sz="4" w:space="0" w:color="000000"/>
-              <w:right w:val="single" w:sz="4" w:space="0" w:color="000000"/>
-            </w:tcBorders>
             <w:shd w:val="clear" w:color="FFFFFF" w:fill="FFFFFF"/>
             <w:noWrap/>
             <w:vAlign w:val="center"/>
@@ -1123,6 +1020,7 @@
                 <w:rFonts w:ascii="Arial" w:eastAsia="新細明體" w:hAnsi="Arial" w:cs="Arial"/>
                 <w:b/>
                 <w:bCs/>
+                <w:noProof/>
                 <w:color w:val="000000"/>
                 <w:kern w:val="0"/>
                 <w14:ligatures w14:val="none"/>
@@ -1168,12 +1066,6 @@
         <w:tc>
           <w:tcPr>
             <w:tcW w:w="0" w:type="auto"/>
-            <w:tcBorders>
-              <w:top w:val="nil"/>
-              <w:left w:val="nil"/>
-              <w:bottom w:val="single" w:sz="4" w:space="0" w:color="000000"/>
-              <w:right w:val="single" w:sz="4" w:space="0" w:color="000000"/>
-            </w:tcBorders>
             <w:shd w:val="clear" w:color="FFFFFF" w:fill="FFFFFF"/>
             <w:noWrap/>
             <w:vAlign w:val="center"/>
@@ -1196,6 +1088,7 @@
                 <w:rFonts w:ascii="Arial" w:eastAsia="新細明體" w:hAnsi="Arial" w:cs="Arial"/>
                 <w:b/>
                 <w:bCs/>
+                <w:noProof/>
                 <w:color w:val="000000"/>
                 <w:kern w:val="0"/>
                 <w14:ligatures w14:val="none"/>
@@ -1241,12 +1134,6 @@
         <w:tc>
           <w:tcPr>
             <w:tcW w:w="0" w:type="auto"/>
-            <w:tcBorders>
-              <w:top w:val="nil"/>
-              <w:left w:val="nil"/>
-              <w:bottom w:val="single" w:sz="4" w:space="0" w:color="000000"/>
-              <w:right w:val="single" w:sz="4" w:space="0" w:color="000000"/>
-            </w:tcBorders>
             <w:shd w:val="clear" w:color="FFFFFF" w:fill="FFFFFF"/>
             <w:noWrap/>
             <w:vAlign w:val="center"/>
@@ -1269,6 +1156,7 @@
                 <w:rFonts w:ascii="Arial" w:eastAsia="新細明體" w:hAnsi="Arial" w:cs="Arial"/>
                 <w:b/>
                 <w:bCs/>
+                <w:noProof/>
                 <w:color w:val="000000"/>
                 <w:kern w:val="0"/>
                 <w14:ligatures w14:val="none"/>
@@ -1314,12 +1202,6 @@
         <w:tc>
           <w:tcPr>
             <w:tcW w:w="0" w:type="auto"/>
-            <w:tcBorders>
-              <w:top w:val="nil"/>
-              <w:left w:val="nil"/>
-              <w:bottom w:val="single" w:sz="4" w:space="0" w:color="000000"/>
-              <w:right w:val="single" w:sz="4" w:space="0" w:color="000000"/>
-            </w:tcBorders>
             <w:shd w:val="clear" w:color="FFFFFF" w:fill="FFFFFF"/>
             <w:noWrap/>
             <w:vAlign w:val="center"/>
@@ -1342,6 +1224,7 @@
                 <w:rFonts w:ascii="Arial" w:eastAsia="新細明體" w:hAnsi="Arial" w:cs="Arial"/>
                 <w:b/>
                 <w:bCs/>
+                <w:noProof/>
                 <w:color w:val="000000"/>
                 <w:kern w:val="0"/>
                 <w14:ligatures w14:val="none"/>
@@ -1387,12 +1270,6 @@
         <w:tc>
           <w:tcPr>
             <w:tcW w:w="1372" w:type="dxa"/>
-            <w:tcBorders>
-              <w:top w:val="nil"/>
-              <w:left w:val="nil"/>
-              <w:bottom w:val="single" w:sz="4" w:space="0" w:color="000000"/>
-              <w:right w:val="single" w:sz="4" w:space="0" w:color="000000"/>
-            </w:tcBorders>
             <w:shd w:val="clear" w:color="FFFFFF" w:fill="FFFFFF"/>
             <w:noWrap/>
             <w:vAlign w:val="center"/>
@@ -1415,6 +1292,7 @@
                 <w:rFonts w:ascii="Arial" w:eastAsia="新細明體" w:hAnsi="Arial" w:cs="Arial"/>
                 <w:b/>
                 <w:bCs/>
+                <w:noProof/>
                 <w:color w:val="000000"/>
                 <w:kern w:val="0"/>
                 <w14:ligatures w14:val="none"/>
@@ -1465,12 +1343,6 @@
         <w:tc>
           <w:tcPr>
             <w:tcW w:w="1103" w:type="dxa"/>
-            <w:tcBorders>
-              <w:top w:val="nil"/>
-              <w:left w:val="single" w:sz="4" w:space="0" w:color="000000"/>
-              <w:bottom w:val="single" w:sz="4" w:space="0" w:color="000000"/>
-              <w:right w:val="single" w:sz="4" w:space="0" w:color="000000"/>
-            </w:tcBorders>
             <w:shd w:val="clear" w:color="FFFFFF" w:fill="FFFFFF"/>
             <w:noWrap/>
             <w:vAlign w:val="center"/>
@@ -1504,32 +1376,27 @@
         <w:tc>
           <w:tcPr>
             <w:tcW w:w="1220" w:type="dxa"/>
-            <w:tcBorders>
-              <w:top w:val="nil"/>
-              <w:left w:val="nil"/>
-              <w:bottom w:val="single" w:sz="4" w:space="0" w:color="000000"/>
-              <w:right w:val="nil"/>
-            </w:tcBorders>
-            <w:shd w:val="clear" w:color="FFFFFF" w:fill="FFFFFF"/>
-          </w:tcPr>
-          <w:p>
-            <w:pPr>
-              <w:widowControl/>
-              <w:spacing w:after="0" w:line="240" w:lineRule="auto"/>
-              <w:rPr>
-                <w:rFonts w:ascii="Arial" w:eastAsia="新細明體" w:hAnsi="Arial" w:cs="Arial"/>
-                <w:b/>
-                <w:bCs/>
-                <w:color w:val="000000"/>
-                <w:kern w:val="0"/>
-                <w14:ligatures w14:val="none"/>
-              </w:rPr>
-            </w:pPr>
-            <w:r>
-              <w:rPr>
-                <w:rFonts w:ascii="Arial" w:eastAsia="新細明體" w:hAnsi="Arial" w:cs="Arial"/>
-                <w:b/>
-                <w:bCs/>
+            <w:shd w:val="clear" w:color="FFFFFF" w:fill="FFFFFF"/>
+          </w:tcPr>
+          <w:p>
+            <w:pPr>
+              <w:widowControl/>
+              <w:spacing w:after="0" w:line="240" w:lineRule="auto"/>
+              <w:rPr>
+                <w:rFonts w:ascii="Arial" w:eastAsia="新細明體" w:hAnsi="Arial" w:cs="Arial"/>
+                <w:b/>
+                <w:bCs/>
+                <w:color w:val="000000"/>
+                <w:kern w:val="0"/>
+                <w14:ligatures w14:val="none"/>
+              </w:rPr>
+            </w:pPr>
+            <w:r>
+              <w:rPr>
+                <w:rFonts w:ascii="Arial" w:eastAsia="新細明體" w:hAnsi="Arial" w:cs="Arial"/>
+                <w:b/>
+                <w:bCs/>
+                <w:noProof/>
                 <w:color w:val="000000"/>
                 <w:kern w:val="0"/>
                 <w14:ligatures w14:val="none"/>
@@ -1575,12 +1442,6 @@
         <w:tc>
           <w:tcPr>
             <w:tcW w:w="0" w:type="auto"/>
-            <w:tcBorders>
-              <w:top w:val="nil"/>
-              <w:left w:val="nil"/>
-              <w:bottom w:val="single" w:sz="4" w:space="0" w:color="000000"/>
-              <w:right w:val="single" w:sz="4" w:space="0" w:color="000000"/>
-            </w:tcBorders>
             <w:shd w:val="clear" w:color="FFFFFF" w:fill="FFFFFF"/>
             <w:noWrap/>
             <w:vAlign w:val="center"/>
@@ -1603,6 +1464,7 @@
                 <w:rFonts w:ascii="Arial" w:eastAsia="新細明體" w:hAnsi="Arial" w:cs="Arial"/>
                 <w:b/>
                 <w:bCs/>
+                <w:noProof/>
                 <w:color w:val="000000"/>
                 <w:kern w:val="0"/>
                 <w14:ligatures w14:val="none"/>
@@ -1648,12 +1510,6 @@
         <w:tc>
           <w:tcPr>
             <w:tcW w:w="0" w:type="auto"/>
-            <w:tcBorders>
-              <w:top w:val="nil"/>
-              <w:left w:val="nil"/>
-              <w:bottom w:val="single" w:sz="4" w:space="0" w:color="000000"/>
-              <w:right w:val="single" w:sz="4" w:space="0" w:color="000000"/>
-            </w:tcBorders>
             <w:shd w:val="clear" w:color="FFFFFF" w:fill="FFFFFF"/>
             <w:noWrap/>
             <w:vAlign w:val="center"/>
@@ -1676,6 +1532,7 @@
                 <w:rFonts w:ascii="Arial" w:eastAsia="新細明體" w:hAnsi="Arial" w:cs="Arial"/>
                 <w:b/>
                 <w:bCs/>
+                <w:noProof/>
                 <w:color w:val="000000"/>
                 <w:kern w:val="0"/>
                 <w14:ligatures w14:val="none"/>
@@ -1721,12 +1578,6 @@
         <w:tc>
           <w:tcPr>
             <w:tcW w:w="0" w:type="auto"/>
-            <w:tcBorders>
-              <w:top w:val="nil"/>
-              <w:left w:val="nil"/>
-              <w:bottom w:val="single" w:sz="4" w:space="0" w:color="000000"/>
-              <w:right w:val="single" w:sz="4" w:space="0" w:color="000000"/>
-            </w:tcBorders>
             <w:shd w:val="clear" w:color="FFFFFF" w:fill="FFFFFF"/>
             <w:noWrap/>
             <w:vAlign w:val="center"/>
@@ -1749,6 +1600,7 @@
                 <w:rFonts w:ascii="Arial" w:eastAsia="新細明體" w:hAnsi="Arial" w:cs="Arial"/>
                 <w:b/>
                 <w:bCs/>
+                <w:noProof/>
                 <w:color w:val="000000"/>
                 <w:kern w:val="0"/>
                 <w14:ligatures w14:val="none"/>
@@ -1794,12 +1646,6 @@
         <w:tc>
           <w:tcPr>
             <w:tcW w:w="0" w:type="auto"/>
-            <w:tcBorders>
-              <w:top w:val="nil"/>
-              <w:left w:val="nil"/>
-              <w:bottom w:val="single" w:sz="4" w:space="0" w:color="000000"/>
-              <w:right w:val="single" w:sz="4" w:space="0" w:color="000000"/>
-            </w:tcBorders>
             <w:shd w:val="clear" w:color="FFFFFF" w:fill="FFFFFF"/>
             <w:noWrap/>
             <w:vAlign w:val="center"/>
@@ -1822,6 +1668,7 @@
                 <w:rFonts w:ascii="Arial" w:eastAsia="新細明體" w:hAnsi="Arial" w:cs="Arial"/>
                 <w:b/>
                 <w:bCs/>
+                <w:noProof/>
                 <w:color w:val="000000"/>
                 <w:kern w:val="0"/>
                 <w14:ligatures w14:val="none"/>
@@ -1867,12 +1714,6 @@
         <w:tc>
           <w:tcPr>
             <w:tcW w:w="0" w:type="auto"/>
-            <w:tcBorders>
-              <w:top w:val="nil"/>
-              <w:left w:val="nil"/>
-              <w:bottom w:val="single" w:sz="4" w:space="0" w:color="000000"/>
-              <w:right w:val="single" w:sz="4" w:space="0" w:color="000000"/>
-            </w:tcBorders>
             <w:shd w:val="clear" w:color="FFFFFF" w:fill="FFFFFF"/>
             <w:noWrap/>
             <w:vAlign w:val="center"/>
@@ -1895,6 +1736,7 @@
                 <w:rFonts w:ascii="Arial" w:eastAsia="新細明體" w:hAnsi="Arial" w:cs="Arial"/>
                 <w:b/>
                 <w:bCs/>
+                <w:noProof/>
                 <w:color w:val="000000"/>
                 <w:kern w:val="0"/>
                 <w14:ligatures w14:val="none"/>
@@ -1940,12 +1782,6 @@
         <w:tc>
           <w:tcPr>
             <w:tcW w:w="1372" w:type="dxa"/>
-            <w:tcBorders>
-              <w:top w:val="nil"/>
-              <w:left w:val="nil"/>
-              <w:bottom w:val="single" w:sz="4" w:space="0" w:color="000000"/>
-              <w:right w:val="single" w:sz="4" w:space="0" w:color="000000"/>
-            </w:tcBorders>
             <w:shd w:val="clear" w:color="FFFFFF" w:fill="FFFFFF"/>
             <w:noWrap/>
             <w:vAlign w:val="center"/>
@@ -1968,6 +1804,7 @@
                 <w:rFonts w:ascii="Arial" w:eastAsia="新細明體" w:hAnsi="Arial" w:cs="Arial"/>
                 <w:b/>
                 <w:bCs/>
+                <w:noProof/>
                 <w:color w:val="000000"/>
                 <w:kern w:val="0"/>
                 <w14:ligatures w14:val="none"/>
@@ -2018,12 +1855,6 @@
         <w:tc>
           <w:tcPr>
             <w:tcW w:w="1103" w:type="dxa"/>
-            <w:tcBorders>
-              <w:top w:val="nil"/>
-              <w:left w:val="single" w:sz="4" w:space="0" w:color="000000"/>
-              <w:bottom w:val="single" w:sz="4" w:space="0" w:color="000000"/>
-              <w:right w:val="single" w:sz="4" w:space="0" w:color="000000"/>
-            </w:tcBorders>
             <w:shd w:val="clear" w:color="FFFFFF" w:fill="FFFFFF"/>
             <w:noWrap/>
             <w:vAlign w:val="center"/>
@@ -2057,32 +1888,27 @@
         <w:tc>
           <w:tcPr>
             <w:tcW w:w="1220" w:type="dxa"/>
-            <w:tcBorders>
-              <w:top w:val="nil"/>
-              <w:left w:val="nil"/>
-              <w:bottom w:val="single" w:sz="4" w:space="0" w:color="000000"/>
-              <w:right w:val="nil"/>
-            </w:tcBorders>
-            <w:shd w:val="clear" w:color="FFFFFF" w:fill="FFFFFF"/>
-          </w:tcPr>
-          <w:p>
-            <w:pPr>
-              <w:widowControl/>
-              <w:spacing w:after="0" w:line="240" w:lineRule="auto"/>
-              <w:rPr>
-                <w:rFonts w:ascii="Arial" w:eastAsia="新細明體" w:hAnsi="Arial" w:cs="Arial"/>
-                <w:b/>
-                <w:bCs/>
-                <w:color w:val="000000"/>
-                <w:kern w:val="0"/>
-                <w14:ligatures w14:val="none"/>
-              </w:rPr>
-            </w:pPr>
-            <w:r>
-              <w:rPr>
-                <w:rFonts w:ascii="Arial" w:eastAsia="新細明體" w:hAnsi="Arial" w:cs="Arial"/>
-                <w:b/>
-                <w:bCs/>
+            <w:shd w:val="clear" w:color="FFFFFF" w:fill="FFFFFF"/>
+          </w:tcPr>
+          <w:p>
+            <w:pPr>
+              <w:widowControl/>
+              <w:spacing w:after="0" w:line="240" w:lineRule="auto"/>
+              <w:rPr>
+                <w:rFonts w:ascii="Arial" w:eastAsia="新細明體" w:hAnsi="Arial" w:cs="Arial"/>
+                <w:b/>
+                <w:bCs/>
+                <w:color w:val="000000"/>
+                <w:kern w:val="0"/>
+                <w14:ligatures w14:val="none"/>
+              </w:rPr>
+            </w:pPr>
+            <w:r>
+              <w:rPr>
+                <w:rFonts w:ascii="Arial" w:eastAsia="新細明體" w:hAnsi="Arial" w:cs="Arial"/>
+                <w:b/>
+                <w:bCs/>
+                <w:noProof/>
                 <w:color w:val="000000"/>
                 <w:kern w:val="0"/>
                 <w14:ligatures w14:val="none"/>
@@ -2128,12 +1954,6 @@
         <w:tc>
           <w:tcPr>
             <w:tcW w:w="0" w:type="auto"/>
-            <w:tcBorders>
-              <w:top w:val="nil"/>
-              <w:left w:val="nil"/>
-              <w:bottom w:val="single" w:sz="4" w:space="0" w:color="000000"/>
-              <w:right w:val="single" w:sz="4" w:space="0" w:color="000000"/>
-            </w:tcBorders>
             <w:shd w:val="clear" w:color="FFFFFF" w:fill="FFFFFF"/>
             <w:noWrap/>
             <w:vAlign w:val="center"/>
@@ -2156,6 +1976,7 @@
                 <w:rFonts w:ascii="Arial" w:eastAsia="新細明體" w:hAnsi="Arial" w:cs="Arial"/>
                 <w:b/>
                 <w:bCs/>
+                <w:noProof/>
                 <w:color w:val="000000"/>
                 <w:kern w:val="0"/>
                 <w14:ligatures w14:val="none"/>
@@ -2201,12 +2022,6 @@
         <w:tc>
           <w:tcPr>
             <w:tcW w:w="0" w:type="auto"/>
-            <w:tcBorders>
-              <w:top w:val="nil"/>
-              <w:left w:val="nil"/>
-              <w:bottom w:val="single" w:sz="4" w:space="0" w:color="000000"/>
-              <w:right w:val="single" w:sz="4" w:space="0" w:color="000000"/>
-            </w:tcBorders>
             <w:shd w:val="clear" w:color="FFFFFF" w:fill="FFFFFF"/>
             <w:noWrap/>
             <w:vAlign w:val="center"/>
@@ -2229,6 +2044,7 @@
                 <w:rFonts w:ascii="Arial" w:eastAsia="新細明體" w:hAnsi="Arial" w:cs="Arial"/>
                 <w:b/>
                 <w:bCs/>
+                <w:noProof/>
                 <w:color w:val="000000"/>
                 <w:kern w:val="0"/>
                 <w14:ligatures w14:val="none"/>
@@ -2274,12 +2090,6 @@
         <w:tc>
           <w:tcPr>
             <w:tcW w:w="0" w:type="auto"/>
-            <w:tcBorders>
-              <w:top w:val="nil"/>
-              <w:left w:val="nil"/>
-              <w:bottom w:val="single" w:sz="4" w:space="0" w:color="000000"/>
-              <w:right w:val="single" w:sz="4" w:space="0" w:color="000000"/>
-            </w:tcBorders>
             <w:shd w:val="clear" w:color="FFFFFF" w:fill="FFFFFF"/>
             <w:noWrap/>
             <w:vAlign w:val="center"/>
@@ -2302,6 +2112,7 @@
                 <w:rFonts w:ascii="Arial" w:eastAsia="新細明體" w:hAnsi="Arial" w:cs="Arial"/>
                 <w:b/>
                 <w:bCs/>
+                <w:noProof/>
                 <w:color w:val="000000"/>
                 <w:kern w:val="0"/>
                 <w14:ligatures w14:val="none"/>
@@ -2347,12 +2158,6 @@
         <w:tc>
           <w:tcPr>
             <w:tcW w:w="0" w:type="auto"/>
-            <w:tcBorders>
-              <w:top w:val="nil"/>
-              <w:left w:val="nil"/>
-              <w:bottom w:val="single" w:sz="4" w:space="0" w:color="000000"/>
-              <w:right w:val="single" w:sz="4" w:space="0" w:color="000000"/>
-            </w:tcBorders>
             <w:shd w:val="clear" w:color="FFFFFF" w:fill="FFFFFF"/>
             <w:noWrap/>
             <w:vAlign w:val="center"/>
@@ -2375,6 +2180,7 @@
                 <w:rFonts w:ascii="Arial" w:eastAsia="新細明體" w:hAnsi="Arial" w:cs="Arial"/>
                 <w:b/>
                 <w:bCs/>
+                <w:noProof/>
                 <w:color w:val="000000"/>
                 <w:kern w:val="0"/>
                 <w14:ligatures w14:val="none"/>
@@ -2420,12 +2226,6 @@
         <w:tc>
           <w:tcPr>
             <w:tcW w:w="0" w:type="auto"/>
-            <w:tcBorders>
-              <w:top w:val="nil"/>
-              <w:left w:val="nil"/>
-              <w:bottom w:val="single" w:sz="4" w:space="0" w:color="000000"/>
-              <w:right w:val="single" w:sz="4" w:space="0" w:color="000000"/>
-            </w:tcBorders>
             <w:shd w:val="clear" w:color="FFFFFF" w:fill="FFFFFF"/>
             <w:noWrap/>
             <w:vAlign w:val="center"/>
@@ -2448,6 +2248,7 @@
                 <w:rFonts w:ascii="Arial" w:eastAsia="新細明體" w:hAnsi="Arial" w:cs="Arial"/>
                 <w:b/>
                 <w:bCs/>
+                <w:noProof/>
                 <w:color w:val="000000"/>
                 <w:kern w:val="0"/>
                 <w14:ligatures w14:val="none"/>
@@ -2493,12 +2294,6 @@
         <w:tc>
           <w:tcPr>
             <w:tcW w:w="1372" w:type="dxa"/>
-            <w:tcBorders>
-              <w:top w:val="nil"/>
-              <w:left w:val="nil"/>
-              <w:bottom w:val="single" w:sz="4" w:space="0" w:color="000000"/>
-              <w:right w:val="single" w:sz="4" w:space="0" w:color="000000"/>
-            </w:tcBorders>
             <w:shd w:val="clear" w:color="FFFFFF" w:fill="FFFFFF"/>
             <w:noWrap/>
             <w:vAlign w:val="center"/>
@@ -2521,6 +2316,7 @@
                 <w:rFonts w:ascii="Arial" w:eastAsia="新細明體" w:hAnsi="Arial" w:cs="Arial"/>
                 <w:b/>
                 <w:bCs/>
+                <w:noProof/>
                 <w:color w:val="000000"/>
                 <w:kern w:val="0"/>
                 <w14:ligatures w14:val="none"/>
@@ -2565,13 +2361,7 @@
         </w:tc>
       </w:tr>
     </w:tbl>
-    <w:p>
-      <w:pPr>
-        <w:rPr>
-          <w:rFonts w:hint="eastAsia"/>
-        </w:rPr>
-      </w:pPr>
-    </w:p>
+    <w:p/>
     <w:sectPr>
       <w:pgSz w:w="11906" w:h="16838"/>
       <w:pgMar w:top="1440" w:right="1800" w:bottom="1440" w:left="1800" w:header="851" w:footer="992" w:gutter="0"/>

</xml_diff>